<commit_message>
Complete task analyses and verified report evidence
</commit_message>
<xml_diff>
--- a/docs/Assignment_Report.docx
+++ b/docs/Assignment_Report.docx
@@ -52,6 +52,86 @@
       </w:r>
     </w:p>
     <w:p>
+      <w:r>
+        <w:rPr>
+          <w:b/>
+        </w:rPr>
+        <w:t>Alternative solution pseudocode:</w:t>
+      </w:r>
+    </w:p>
+    <w:p>
+      <w:pPr>
+        <w:keepNext/>
+        <w:spacing w:after="0" w:line="240" w:lineRule="auto"/>
+      </w:pPr>
+      <w:r>
+        <w:t>ALTERNATIVE PSEUDOCODE</w:t>
+      </w:r>
+    </w:p>
+    <w:p>
+      <w:pPr>
+        <w:keepNext/>
+        <w:spacing w:after="0" w:line="240" w:lineRule="auto"/>
+      </w:pPr>
+      <w:r>
+        <w:t>INPUT regNo[], type[], entryTime[], searchKey, n</w:t>
+      </w:r>
+    </w:p>
+    <w:p>
+      <w:pPr>
+        <w:keepNext/>
+        <w:spacing w:after="0" w:line="240" w:lineRule="auto"/>
+      </w:pPr>
+      <w:r>
+        <w:t>BEGIN</w:t>
+      </w:r>
+    </w:p>
+    <w:p>
+      <w:pPr>
+        <w:keepNext/>
+        <w:spacing w:after="0" w:line="240" w:lineRule="auto"/>
+      </w:pPr>
+      <w:r>
+        <w:t xml:space="preserve">  FOR i FROM 0 TO n - 1 DO</w:t>
+      </w:r>
+    </w:p>
+    <w:p>
+      <w:pPr>
+        <w:keepNext/>
+        <w:spacing w:after="0" w:line="240" w:lineRule="auto"/>
+      </w:pPr>
+      <w:r>
+        <w:t xml:space="preserve">    IF regNo[i] = searchKey THEN RETURN i ENDIF</w:t>
+      </w:r>
+    </w:p>
+    <w:p>
+      <w:pPr>
+        <w:keepNext/>
+        <w:spacing w:after="0" w:line="240" w:lineRule="auto"/>
+      </w:pPr>
+      <w:r>
+        <w:t xml:space="preserve">  ENDFOR</w:t>
+      </w:r>
+    </w:p>
+    <w:p>
+      <w:pPr>
+        <w:keepNext/>
+        <w:spacing w:after="0" w:line="240" w:lineRule="auto"/>
+      </w:pPr>
+      <w:r>
+        <w:t xml:space="preserve">  RETURN NOT_FOUND</w:t>
+      </w:r>
+    </w:p>
+    <w:p>
+      <w:pPr>
+        <w:keepNext w:val="0"/>
+        <w:spacing w:after="0" w:line="240" w:lineRule="auto"/>
+      </w:pPr>
+      <w:r>
+        <w:t>END</w:t>
+      </w:r>
+    </w:p>
+    <w:p>
       <w:pPr>
         <w:pStyle w:val="Heading1"/>
         <w:pageBreakBefore/>
@@ -93,6 +173,140 @@
       </w:r>
     </w:p>
     <w:p>
+      <w:r>
+        <w:rPr>
+          <w:b/>
+        </w:rPr>
+        <w:t>Alternative solution pseudocode:</w:t>
+      </w:r>
+    </w:p>
+    <w:p>
+      <w:pPr>
+        <w:keepNext/>
+        <w:spacing w:after="0" w:line="240" w:lineRule="auto"/>
+      </w:pPr>
+      <w:r>
+        <w:t>ALTERNATIVE PSEUDOCODE</w:t>
+      </w:r>
+    </w:p>
+    <w:p>
+      <w:pPr>
+        <w:keepNext/>
+        <w:spacing w:after="0" w:line="240" w:lineRule="auto"/>
+      </w:pPr>
+      <w:r>
+        <w:t>INPUT capacity[0..F-1], floor, slot</w:t>
+      </w:r>
+    </w:p>
+    <w:p>
+      <w:pPr>
+        <w:keepNext/>
+        <w:spacing w:after="0" w:line="240" w:lineRule="auto"/>
+      </w:pPr>
+      <w:r>
+        <w:t>BEGIN</w:t>
+      </w:r>
+    </w:p>
+    <w:p>
+      <w:pPr>
+        <w:keepNext/>
+        <w:spacing w:after="0" w:line="240" w:lineRule="auto"/>
+      </w:pPr>
+      <w:r>
+        <w:t xml:space="preserve">  offset[0] &lt;- 0</w:t>
+      </w:r>
+    </w:p>
+    <w:p>
+      <w:pPr>
+        <w:keepNext/>
+        <w:spacing w:after="0" w:line="240" w:lineRule="auto"/>
+      </w:pPr>
+      <w:r>
+        <w:t xml:space="preserve">  FOR f FROM 1 TO F - 1 DO</w:t>
+      </w:r>
+    </w:p>
+    <w:p>
+      <w:pPr>
+        <w:keepNext/>
+        <w:spacing w:after="0" w:line="240" w:lineRule="auto"/>
+      </w:pPr>
+      <w:r>
+        <w:t xml:space="preserve">    offset[f] &lt;- offset[f-1] + capacity[f-1]</w:t>
+      </w:r>
+    </w:p>
+    <w:p>
+      <w:pPr>
+        <w:keepNext/>
+        <w:spacing w:after="0" w:line="240" w:lineRule="auto"/>
+      </w:pPr>
+      <w:r>
+        <w:t xml:space="preserve">  ENDFOR</w:t>
+      </w:r>
+    </w:p>
+    <w:p>
+      <w:pPr>
+        <w:keepNext/>
+        <w:spacing w:after="0" w:line="240" w:lineRule="auto"/>
+      </w:pPr>
+      <w:r>
+        <w:t xml:space="preserve">  IF floor &lt; 0 OR floor &gt;= F THEN REJECT ENDIF</w:t>
+      </w:r>
+    </w:p>
+    <w:p>
+      <w:pPr>
+        <w:keepNext/>
+        <w:spacing w:after="0" w:line="240" w:lineRule="auto"/>
+      </w:pPr>
+      <w:r>
+        <w:t xml:space="preserve">  IF slot &lt; 0 OR slot &gt;= capacity[floor] THEN REJECT ENDIF</w:t>
+      </w:r>
+    </w:p>
+    <w:p>
+      <w:pPr>
+        <w:keepNext/>
+        <w:spacing w:after="0" w:line="240" w:lineRule="auto"/>
+      </w:pPr>
+      <w:r>
+        <w:t xml:space="preserve">  index &lt;- offset[floor] + slot</w:t>
+      </w:r>
+    </w:p>
+    <w:p>
+      <w:pPr>
+        <w:keepNext/>
+        <w:spacing w:after="0" w:line="240" w:lineRule="auto"/>
+      </w:pPr>
+      <w:r>
+        <w:t xml:space="preserve">  RETURN flatSlots[index]</w:t>
+      </w:r>
+    </w:p>
+    <w:p>
+      <w:pPr>
+        <w:keepNext/>
+        <w:spacing w:after="0" w:line="240" w:lineRule="auto"/>
+      </w:pPr>
+      <w:r>
+        <w:t>END</w:t>
+      </w:r>
+    </w:p>
+    <w:p>
+      <w:pPr>
+        <w:keepNext/>
+        <w:spacing w:after="0" w:line="240" w:lineRule="auto"/>
+      </w:pPr>
+      <w:r>
+        <w:t>ArrayList alternative: rows.get(floor)[slot]</w:t>
+      </w:r>
+    </w:p>
+    <w:p>
+      <w:pPr>
+        <w:keepNext w:val="0"/>
+        <w:spacing w:after="0" w:line="240" w:lineRule="auto"/>
+      </w:pPr>
+      <w:r>
+        <w:t>Each row is allocated using its own floor capacity.</w:t>
+      </w:r>
+    </w:p>
+    <w:p>
       <w:pPr>
         <w:pStyle w:val="Heading1"/>
         <w:pageBreakBefore/>
@@ -427,7 +641,7 @@
         <w:rPr>
           <w:b w:val="0"/>
         </w:rPr>
-        <w:t>Task03/Task03.java allocates the first free slot, validates release requests and matches all six expected output lines. The class name is Task03; the allocation and release behaviour follows the supplied program. The integrated facility adds suitability and duplicate checks.</w:t>
+        <w:t>Task03/ParkingFacility.java completes the supplied allocation and release program and matches all six expected output lines. The supplied main method is unchanged apart from omitted explanatory comments. Task03.java is a task-numbered launcher which calls ParkingFacility.main(args). The integrated facility separately adds suitability and duplicate-registration checks.</w:t>
       </w:r>
     </w:p>
     <w:p>
@@ -439,14 +653,182 @@
       </w:r>
     </w:p>
     <w:p>
-      <w:pPr>
-        <w:keepNext/>
-      </w:pPr>
       <w:r>
         <w:rPr>
           <w:b/>
         </w:rPr>
-        <w:t>Task03.java</w:t>
+        <w:t>Alternative solution pseudocode:</w:t>
+      </w:r>
+    </w:p>
+    <w:p>
+      <w:pPr>
+        <w:keepNext/>
+        <w:spacing w:after="0" w:line="240" w:lineRule="auto"/>
+      </w:pPr>
+      <w:r>
+        <w:t>ALTERNATIVE PSEUDOCODE</w:t>
+      </w:r>
+    </w:p>
+    <w:p>
+      <w:pPr>
+        <w:keepNext/>
+        <w:spacing w:after="0" w:line="240" w:lineRule="auto"/>
+      </w:pPr>
+      <w:r>
+        <w:t>INPUT vehicle, freeStack[], freeCount[], occupied[][]</w:t>
+      </w:r>
+    </w:p>
+    <w:p>
+      <w:pPr>
+        <w:keepNext/>
+        <w:spacing w:after="0" w:line="240" w:lineRule="auto"/>
+      </w:pPr>
+      <w:r>
+        <w:t>BEGIN</w:t>
+      </w:r>
+    </w:p>
+    <w:p>
+      <w:pPr>
+        <w:keepNext/>
+        <w:spacing w:after="0" w:line="240" w:lineRule="auto"/>
+      </w:pPr>
+      <w:r>
+        <w:t xml:space="preserve">  FOR f FROM 0 TO F - 1 DO</w:t>
+      </w:r>
+    </w:p>
+    <w:p>
+      <w:pPr>
+        <w:keepNext/>
+        <w:spacing w:after="0" w:line="240" w:lineRule="auto"/>
+      </w:pPr>
+      <w:r>
+        <w:t xml:space="preserve">    IF freeCount[f] &gt; 0 THEN</w:t>
+      </w:r>
+    </w:p>
+    <w:p>
+      <w:pPr>
+        <w:keepNext/>
+        <w:spacing w:after="0" w:line="240" w:lineRule="auto"/>
+      </w:pPr>
+      <w:r>
+        <w:t xml:space="preserve">      s &lt;- POP(freeStack[f])</w:t>
+      </w:r>
+    </w:p>
+    <w:p>
+      <w:pPr>
+        <w:keepNext/>
+        <w:spacing w:after="0" w:line="240" w:lineRule="auto"/>
+      </w:pPr>
+      <w:r>
+        <w:t xml:space="preserve">      occupied[f][s] &lt;- vehicle</w:t>
+      </w:r>
+    </w:p>
+    <w:p>
+      <w:pPr>
+        <w:keepNext/>
+        <w:spacing w:after="0" w:line="240" w:lineRule="auto"/>
+      </w:pPr>
+      <w:r>
+        <w:t xml:space="preserve">      freeCount[f] &lt;- freeCount[f] - 1</w:t>
+      </w:r>
+    </w:p>
+    <w:p>
+      <w:pPr>
+        <w:keepNext/>
+        <w:spacing w:after="0" w:line="240" w:lineRule="auto"/>
+      </w:pPr>
+      <w:r>
+        <w:t xml:space="preserve">      RETURN (f, s)</w:t>
+      </w:r>
+    </w:p>
+    <w:p>
+      <w:pPr>
+        <w:keepNext/>
+        <w:spacing w:after="0" w:line="240" w:lineRule="auto"/>
+      </w:pPr>
+      <w:r>
+        <w:t xml:space="preserve">    ENDIF</w:t>
+      </w:r>
+    </w:p>
+    <w:p>
+      <w:pPr>
+        <w:keepNext/>
+        <w:spacing w:after="0" w:line="240" w:lineRule="auto"/>
+      </w:pPr>
+      <w:r>
+        <w:t xml:space="preserve">  ENDFOR</w:t>
+      </w:r>
+    </w:p>
+    <w:p>
+      <w:pPr>
+        <w:keepNext/>
+        <w:spacing w:after="0" w:line="240" w:lineRule="auto"/>
+      </w:pPr>
+      <w:r>
+        <w:t xml:space="preserve">  RETURN FULL</w:t>
+      </w:r>
+    </w:p>
+    <w:p>
+      <w:pPr>
+        <w:keepNext/>
+        <w:spacing w:after="0" w:line="240" w:lineRule="auto"/>
+      </w:pPr>
+      <w:r>
+        <w:t>END</w:t>
+      </w:r>
+    </w:p>
+    <w:p>
+      <w:pPr>
+        <w:keepNext/>
+        <w:spacing w:after="0" w:line="240" w:lineRule="auto"/>
+      </w:pPr>
+      <w:r>
+        <w:t>RELEASE(f, s): validate indexes and occupied[f][s]</w:t>
+      </w:r>
+    </w:p>
+    <w:p>
+      <w:pPr>
+        <w:keepNext/>
+        <w:spacing w:after="0" w:line="240" w:lineRule="auto"/>
+      </w:pPr>
+      <w:r>
+        <w:t>IF invalid OR already free THEN RETURN false ENDIF</w:t>
+      </w:r>
+    </w:p>
+    <w:p>
+      <w:pPr>
+        <w:keepNext/>
+        <w:spacing w:after="0" w:line="240" w:lineRule="auto"/>
+      </w:pPr>
+      <w:r>
+        <w:t>occupied[f][s] &lt;- null</w:t>
+      </w:r>
+    </w:p>
+    <w:p>
+      <w:pPr>
+        <w:keepNext/>
+        <w:spacing w:after="0" w:line="240" w:lineRule="auto"/>
+      </w:pPr>
+      <w:r>
+        <w:t>PUSH(freeStack[f], s)</w:t>
+      </w:r>
+    </w:p>
+    <w:p>
+      <w:pPr>
+        <w:keepNext/>
+        <w:spacing w:after="0" w:line="240" w:lineRule="auto"/>
+      </w:pPr>
+      <w:r>
+        <w:t>freeCount[f] &lt;- freeCount[f] + 1</w:t>
+      </w:r>
+    </w:p>
+    <w:p>
+      <w:pPr>
+        <w:keepNext/>
+        <w:spacing w:after="0" w:line="240" w:lineRule="auto"/>
+      </w:pPr>
+      <w:r>
+        <w:t>RETURN true</w:t>
       </w:r>
     </w:p>
     <w:p>
@@ -455,7 +837,18 @@
         <w:spacing w:after="0" w:line="240" w:lineRule="auto"/>
       </w:pPr>
       <w:r>
-        <w:t>public class Task03 {</w:t>
+        <w:t>For typed slots, maintain separate suitable free pools.</w:t>
+      </w:r>
+    </w:p>
+    <w:p>
+      <w:pPr>
+        <w:keepNext/>
+      </w:pPr>
+      <w:r>
+        <w:rPr>
+          <w:b/>
+        </w:rPr>
+        <w:t>ParkingFacility.java</w:t>
       </w:r>
     </w:p>
     <w:p>
@@ -464,7 +857,7 @@
         <w:spacing w:after="0" w:line="240" w:lineRule="auto"/>
       </w:pPr>
       <w:r>
-        <w:t xml:space="preserve">    private final String[][] slots;</w:t>
+        <w:t>public class ParkingFacility {</w:t>
       </w:r>
     </w:p>
     <w:p>
@@ -473,7 +866,7 @@
         <w:spacing w:after="0" w:line="240" w:lineRule="auto"/>
       </w:pPr>
       <w:r>
-        <w:t xml:space="preserve">    public Task03(int[] slotsPerFloor) {</w:t>
+        <w:t xml:space="preserve">    private final String[][] slots;</w:t>
       </w:r>
     </w:p>
     <w:p>
@@ -482,7 +875,7 @@
         <w:spacing w:after="0" w:line="240" w:lineRule="auto"/>
       </w:pPr>
       <w:r>
-        <w:t xml:space="preserve">        slots = new String[slotsPerFloor.length][];</w:t>
+        <w:t xml:space="preserve">    public ParkingFacility(int[] slotsPerFloor) {</w:t>
       </w:r>
     </w:p>
     <w:p>
@@ -491,7 +884,7 @@
         <w:spacing w:after="0" w:line="240" w:lineRule="auto"/>
       </w:pPr>
       <w:r>
-        <w:t xml:space="preserve">        for (int f = 0; f &lt; slotsPerFloor.length; f++) {</w:t>
+        <w:t xml:space="preserve">        slots = new String[slotsPerFloor.length][];</w:t>
       </w:r>
     </w:p>
     <w:p>
@@ -500,7 +893,7 @@
         <w:spacing w:after="0" w:line="240" w:lineRule="auto"/>
       </w:pPr>
       <w:r>
-        <w:t xml:space="preserve">            slots[f] = new String[slotsPerFloor[f]];</w:t>
+        <w:t xml:space="preserve">        for (int f = 0; f &lt; slotsPerFloor.length; f++) {</w:t>
       </w:r>
     </w:p>
     <w:p>
@@ -509,7 +902,7 @@
         <w:spacing w:after="0" w:line="240" w:lineRule="auto"/>
       </w:pPr>
       <w:r>
-        <w:t xml:space="preserve">        }</w:t>
+        <w:t xml:space="preserve">            slots[f] = new String[slotsPerFloor[f]];</w:t>
       </w:r>
     </w:p>
     <w:p>
@@ -518,7 +911,7 @@
         <w:spacing w:after="0" w:line="240" w:lineRule="auto"/>
       </w:pPr>
       <w:r>
-        <w:t xml:space="preserve">    }</w:t>
+        <w:t xml:space="preserve">        }</w:t>
       </w:r>
     </w:p>
     <w:p>
@@ -527,7 +920,7 @@
         <w:spacing w:after="0" w:line="240" w:lineRule="auto"/>
       </w:pPr>
       <w:r>
-        <w:t xml:space="preserve">    public int[] allocate(String vehicleNo) {</w:t>
+        <w:t xml:space="preserve">    }</w:t>
       </w:r>
     </w:p>
     <w:p>
@@ -536,7 +929,7 @@
         <w:spacing w:after="0" w:line="240" w:lineRule="auto"/>
       </w:pPr>
       <w:r>
-        <w:t xml:space="preserve">        for (int f = 0; f &lt; slots.length; f++) {</w:t>
+        <w:t xml:space="preserve">    public int[] allocate(String vehicleNo) {</w:t>
       </w:r>
     </w:p>
     <w:p>
@@ -545,7 +938,7 @@
         <w:spacing w:after="0" w:line="240" w:lineRule="auto"/>
       </w:pPr>
       <w:r>
-        <w:t xml:space="preserve">            for (int s = 0; s &lt; slots[f].length; s++) {</w:t>
+        <w:t xml:space="preserve">        for (int f = 0; f &lt; slots.length; f++) {</w:t>
       </w:r>
     </w:p>
     <w:p>
@@ -554,7 +947,7 @@
         <w:spacing w:after="0" w:line="240" w:lineRule="auto"/>
       </w:pPr>
       <w:r>
-        <w:t xml:space="preserve">                if (slots[f][s] == null) {</w:t>
+        <w:t xml:space="preserve">            for (int s = 0; s &lt; slots[f].length; s++) {</w:t>
       </w:r>
     </w:p>
     <w:p>
@@ -563,7 +956,7 @@
         <w:spacing w:after="0" w:line="240" w:lineRule="auto"/>
       </w:pPr>
       <w:r>
-        <w:t xml:space="preserve">                    slots[f][s] = vehicleNo;</w:t>
+        <w:t xml:space="preserve">                if (slots[f][s] == null) {</w:t>
       </w:r>
     </w:p>
     <w:p>
@@ -572,7 +965,7 @@
         <w:spacing w:after="0" w:line="240" w:lineRule="auto"/>
       </w:pPr>
       <w:r>
-        <w:t xml:space="preserve">                    return new int[]{f, s};</w:t>
+        <w:t xml:space="preserve">                    slots[f][s] = vehicleNo;</w:t>
       </w:r>
     </w:p>
     <w:p>
@@ -581,7 +974,7 @@
         <w:spacing w:after="0" w:line="240" w:lineRule="auto"/>
       </w:pPr>
       <w:r>
-        <w:t xml:space="preserve">                }</w:t>
+        <w:t xml:space="preserve">                    return new int[]{f, s};</w:t>
       </w:r>
     </w:p>
     <w:p>
@@ -590,7 +983,7 @@
         <w:spacing w:after="0" w:line="240" w:lineRule="auto"/>
       </w:pPr>
       <w:r>
-        <w:t xml:space="preserve">            }</w:t>
+        <w:t xml:space="preserve">                }</w:t>
       </w:r>
     </w:p>
     <w:p>
@@ -599,7 +992,7 @@
         <w:spacing w:after="0" w:line="240" w:lineRule="auto"/>
       </w:pPr>
       <w:r>
-        <w:t xml:space="preserve">        }</w:t>
+        <w:t xml:space="preserve">            }</w:t>
       </w:r>
     </w:p>
     <w:p>
@@ -608,7 +1001,7 @@
         <w:spacing w:after="0" w:line="240" w:lineRule="auto"/>
       </w:pPr>
       <w:r>
-        <w:t xml:space="preserve">        return null;</w:t>
+        <w:t xml:space="preserve">        }</w:t>
       </w:r>
     </w:p>
     <w:p>
@@ -617,7 +1010,7 @@
         <w:spacing w:after="0" w:line="240" w:lineRule="auto"/>
       </w:pPr>
       <w:r>
-        <w:t xml:space="preserve">    }</w:t>
+        <w:t xml:space="preserve">        return null;</w:t>
       </w:r>
     </w:p>
     <w:p>
@@ -626,7 +1019,7 @@
         <w:spacing w:after="0" w:line="240" w:lineRule="auto"/>
       </w:pPr>
       <w:r>
-        <w:t xml:space="preserve">    public boolean release(int floor, int slot) {</w:t>
+        <w:t xml:space="preserve">    }</w:t>
       </w:r>
     </w:p>
     <w:p>
@@ -635,7 +1028,7 @@
         <w:spacing w:after="0" w:line="240" w:lineRule="auto"/>
       </w:pPr>
       <w:r>
-        <w:t xml:space="preserve">        if (floor &lt; 0 || floor &gt;= slots.length || slot &lt; 0 || slot &gt;= slots[floor].length</w:t>
+        <w:t xml:space="preserve">    public boolean release(int floor, int slot) {</w:t>
       </w:r>
     </w:p>
     <w:p>
@@ -644,7 +1037,7 @@
         <w:spacing w:after="0" w:line="240" w:lineRule="auto"/>
       </w:pPr>
       <w:r>
-        <w:t xml:space="preserve">                || slots[floor][slot] == null) return false;</w:t>
+        <w:t xml:space="preserve">        if (floor &lt; 0 || floor &gt;= slots.length || slot &lt; 0 || slot &gt;= slots[floor].length</w:t>
       </w:r>
     </w:p>
     <w:p>
@@ -653,7 +1046,7 @@
         <w:spacing w:after="0" w:line="240" w:lineRule="auto"/>
       </w:pPr>
       <w:r>
-        <w:t xml:space="preserve">        slots[floor][slot] = null;</w:t>
+        <w:t xml:space="preserve">                || slots[floor][slot] == null) return false;</w:t>
       </w:r>
     </w:p>
     <w:p>
@@ -662,7 +1055,7 @@
         <w:spacing w:after="0" w:line="240" w:lineRule="auto"/>
       </w:pPr>
       <w:r>
-        <w:t xml:space="preserve">        return true;</w:t>
+        <w:t xml:space="preserve">        slots[floor][slot] = null;</w:t>
       </w:r>
     </w:p>
     <w:p>
@@ -671,7 +1064,7 @@
         <w:spacing w:after="0" w:line="240" w:lineRule="auto"/>
       </w:pPr>
       <w:r>
-        <w:t xml:space="preserve">    }</w:t>
+        <w:t xml:space="preserve">        return true;</w:t>
       </w:r>
     </w:p>
     <w:p>
@@ -680,7 +1073,7 @@
         <w:spacing w:after="0" w:line="240" w:lineRule="auto"/>
       </w:pPr>
       <w:r>
-        <w:t xml:space="preserve">    public static void main(String[] args) {</w:t>
+        <w:t xml:space="preserve">    }</w:t>
       </w:r>
     </w:p>
     <w:p>
@@ -689,7 +1082,16 @@
         <w:spacing w:after="0" w:line="240" w:lineRule="auto"/>
       </w:pPr>
       <w:r>
-        <w:t xml:space="preserve">        Task03 p = new Task03(new int[]{2, 1});</w:t>
+        <w:t xml:space="preserve">    public static void main(String[] args) {</w:t>
+      </w:r>
+    </w:p>
+    <w:p>
+      <w:pPr>
+        <w:keepNext w:val="0"/>
+        <w:spacing w:after="0" w:line="240" w:lineRule="auto"/>
+      </w:pPr>
+      <w:r>
+        <w:t xml:space="preserve">        ParkingFacility p = new ParkingFacility(new int[]{2, 1});</w:t>
       </w:r>
     </w:p>
     <w:p>
@@ -927,6 +1329,122 @@
       </w:r>
     </w:p>
     <w:p>
+      <w:r>
+        <w:rPr>
+          <w:b/>
+        </w:rPr>
+        <w:t>Alternative solution pseudocode:</w:t>
+      </w:r>
+    </w:p>
+    <w:p>
+      <w:pPr>
+        <w:keepNext/>
+        <w:spacing w:after="0" w:line="240" w:lineRule="auto"/>
+      </w:pPr>
+      <w:r>
+        <w:t>ALTERNATIVE PSEUDOCODE</w:t>
+      </w:r>
+    </w:p>
+    <w:p>
+      <w:pPr>
+        <w:keepNext/>
+        <w:spacing w:after="0" w:line="240" w:lineRule="auto"/>
+      </w:pPr>
+      <w:r>
+        <w:t>Default constructor plus setters:</w:t>
+      </w:r>
+    </w:p>
+    <w:p>
+      <w:pPr>
+        <w:keepNext/>
+        <w:spacing w:after="0" w:line="240" w:lineRule="auto"/>
+      </w:pPr>
+      <w:r>
+        <w:t xml:space="preserve">  t &lt;- new MutableTicket()</w:t>
+      </w:r>
+    </w:p>
+    <w:p>
+      <w:pPr>
+        <w:keepNext/>
+        <w:spacing w:after="0" w:line="240" w:lineRule="auto"/>
+      </w:pPr>
+      <w:r>
+        <w:t xml:space="preserve">  t.setVehicle(vehicle)</w:t>
+      </w:r>
+    </w:p>
+    <w:p>
+      <w:pPr>
+        <w:keepNext/>
+        <w:spacing w:after="0" w:line="240" w:lineRule="auto"/>
+      </w:pPr>
+      <w:r>
+        <w:t xml:space="preserve">  t.setSlot(slot)</w:t>
+      </w:r>
+    </w:p>
+    <w:p>
+      <w:pPr>
+        <w:keepNext/>
+        <w:spacing w:after="0" w:line="240" w:lineRule="auto"/>
+      </w:pPr>
+      <w:r>
+        <w:t xml:space="preserve">  t.setEntry(entry)</w:t>
+      </w:r>
+    </w:p>
+    <w:p>
+      <w:pPr>
+        <w:keepNext/>
+        <w:spacing w:after="0" w:line="240" w:lineRule="auto"/>
+      </w:pPr>
+      <w:r>
+        <w:t xml:space="preserve">  t.validateComplete()</w:t>
+      </w:r>
+    </w:p>
+    <w:p>
+      <w:pPr>
+        <w:keepNext/>
+        <w:spacing w:after="0" w:line="240" w:lineRule="auto"/>
+      </w:pPr>
+      <w:r>
+        <w:t>Static factory:</w:t>
+      </w:r>
+    </w:p>
+    <w:p>
+      <w:pPr>
+        <w:keepNext/>
+        <w:spacing w:after="0" w:line="240" w:lineRule="auto"/>
+      </w:pPr>
+      <w:r>
+        <w:t xml:space="preserve">  FUNCTION issue(vehicle, slot, entry)</w:t>
+      </w:r>
+    </w:p>
+    <w:p>
+      <w:pPr>
+        <w:keepNext/>
+        <w:spacing w:after="0" w:line="240" w:lineRule="auto"/>
+      </w:pPr>
+      <w:r>
+        <w:t xml:space="preserve">    validate vehicle, slot and entry</w:t>
+      </w:r>
+    </w:p>
+    <w:p>
+      <w:pPr>
+        <w:keepNext/>
+        <w:spacing w:after="0" w:line="240" w:lineRule="auto"/>
+      </w:pPr>
+      <w:r>
+        <w:t xml:space="preserve">    RETURN new ParkingTicket(vehicle, slot, entry)</w:t>
+      </w:r>
+    </w:p>
+    <w:p>
+      <w:pPr>
+        <w:keepNext w:val="0"/>
+        <w:spacing w:after="0" w:line="240" w:lineRule="auto"/>
+      </w:pPr>
+      <w:r>
+        <w:t xml:space="preserve">  END FUNCTION</w:t>
+      </w:r>
+    </w:p>
+    <w:p>
       <w:pPr>
         <w:pStyle w:val="Heading1"/>
         <w:pageBreakBefore/>
@@ -968,6 +1486,122 @@
       </w:r>
     </w:p>
     <w:p>
+      <w:r>
+        <w:rPr>
+          <w:b/>
+        </w:rPr>
+        <w:t>Alternative solution pseudocode:</w:t>
+      </w:r>
+    </w:p>
+    <w:p>
+      <w:pPr>
+        <w:keepNext/>
+        <w:spacing w:after="0" w:line="240" w:lineRule="auto"/>
+      </w:pPr>
+      <w:r>
+        <w:t>ALTERNATIVE PSEUDOCODE</w:t>
+      </w:r>
+    </w:p>
+    <w:p>
+      <w:pPr>
+        <w:keepNext/>
+        <w:spacing w:after="0" w:line="240" w:lineRule="auto"/>
+      </w:pPr>
+      <w:r>
+        <w:t>Each facility stores facilityId and nextNumber &lt;- 1</w:t>
+      </w:r>
+    </w:p>
+    <w:p>
+      <w:pPr>
+        <w:keepNext/>
+        <w:spacing w:after="0" w:line="240" w:lineRule="auto"/>
+      </w:pPr>
+      <w:r>
+        <w:t>FUNCTION issueLocalId(facility)</w:t>
+      </w:r>
+    </w:p>
+    <w:p>
+      <w:pPr>
+        <w:keepNext/>
+        <w:spacing w:after="0" w:line="240" w:lineRule="auto"/>
+      </w:pPr>
+      <w:r>
+        <w:t>BEGIN</w:t>
+      </w:r>
+    </w:p>
+    <w:p>
+      <w:pPr>
+        <w:keepNext/>
+        <w:spacing w:after="0" w:line="240" w:lineRule="auto"/>
+      </w:pPr>
+      <w:r>
+        <w:t xml:space="preserve">  id &lt;- facility.facilityId + "-" + facility.nextNumber</w:t>
+      </w:r>
+    </w:p>
+    <w:p>
+      <w:pPr>
+        <w:keepNext/>
+        <w:spacing w:after="0" w:line="240" w:lineRule="auto"/>
+      </w:pPr>
+      <w:r>
+        <w:t xml:space="preserve">  facility.nextNumber &lt;- facility.nextNumber + 1</w:t>
+      </w:r>
+    </w:p>
+    <w:p>
+      <w:pPr>
+        <w:keepNext/>
+        <w:spacing w:after="0" w:line="240" w:lineRule="auto"/>
+      </w:pPr>
+      <w:r>
+        <w:t xml:space="preserve">  persist the updated counter before returning id</w:t>
+      </w:r>
+    </w:p>
+    <w:p>
+      <w:pPr>
+        <w:keepNext/>
+        <w:spacing w:after="0" w:line="240" w:lineRule="auto"/>
+      </w:pPr>
+      <w:r>
+        <w:t xml:space="preserve">  RETURN id</w:t>
+      </w:r>
+    </w:p>
+    <w:p>
+      <w:pPr>
+        <w:keepNext/>
+        <w:spacing w:after="0" w:line="240" w:lineRule="auto"/>
+      </w:pPr>
+      <w:r>
+        <w:t>END</w:t>
+      </w:r>
+    </w:p>
+    <w:p>
+      <w:pPr>
+        <w:keepNext/>
+        <w:spacing w:after="0" w:line="240" w:lineRule="auto"/>
+      </w:pPr>
+      <w:r>
+        <w:t>North and south use different permanent facility IDs.</w:t>
+      </w:r>
+    </w:p>
+    <w:p>
+      <w:pPr>
+        <w:keepNext/>
+        <w:spacing w:after="0" w:line="240" w:lineRule="auto"/>
+      </w:pPr>
+      <w:r>
+        <w:t>Global alternative: all facilities request the next ID</w:t>
+      </w:r>
+    </w:p>
+    <w:p>
+      <w:pPr>
+        <w:keepNext w:val="0"/>
+        <w:spacing w:after="0" w:line="240" w:lineRule="auto"/>
+      </w:pPr>
+      <w:r>
+        <w:t>from one durable shared counter instead.</w:t>
+      </w:r>
+    </w:p>
+    <w:p>
       <w:pPr>
         <w:pStyle w:val="Heading1"/>
         <w:pageBreakBefore/>
@@ -989,7 +1623,7 @@
         <w:rPr>
           <w:b w:val="0"/>
         </w:rPr>
-        <w:t>Each child constructor calls super(regNo). Constructor execution for new ElectricCar("TN01E1") runs Object, Vehicle, Car, ElectricCar in that order; argument evaluation occurs before the called constructor body. Task06's separate TraceVehicle/TraceCar/TraceElectricCar classes print 1 Vehicle constructor, 2 Car constructor, 3 ElectricCar constructor without inserting debugging output into the shared domain classes. super.method() can deliberately invoke the parent implementation when a subclass augments it; protected methods are available to subclasses but the registration remains private. Using a super field access would still require that field to be accessible, so exposing regNo merely to demonstrate it is inappropriate.</w:t>
+        <w:t>Each child constructor calls super(regNo). Constructor execution for new ElectricCar("TN01E1") runs Object, Vehicle, Car, ElectricCar in that order; argument evaluation occurs before the called constructor body. Task06 constructs the actual ElectricCar model object. With the parking.trace property enabled, the real Vehicle, Car and ElectricCar constructors print their execution order. The property is cleared immediately afterward, so normal runs produce no constructor diagnostics. super.method() can deliberately invoke the parent implementation when a subclass augments it; protected methods are available to subclasses but the registration remains private. Using a super field access would still require that field to be accessible, so exposing regNo merely to demonstrate it is inappropriate.</w:t>
       </w:r>
     </w:p>
     <w:p>
@@ -1006,6 +1640,122 @@
           <w:b w:val="0"/>
         </w:rPr>
         <w:t>Alternative: Vehicle has-a VehicleType(registration-independent name, hourlyRate). Example: Vehicle v = new Vehicle(reg, new VehicleType("CAR",30)); fee = ceilHours(minutes) * v.type.rate. Adding a simple new rate can then be a configuration entry without a new subclass. A subclass hierarchy adds a type class and factory registration; composition adds a policy/configuration object and factory registration. Both charge in O(1) for fixed rules; the inheritance vehicle stores O(1) state and dispatch metadata, while composition adds O(1) reference per vehicle plus O(k) shared type objects. A fresh type object per vehicle uses O(n) type objects, which can be avoided by sharing immutable types. Inheritance clearly demonstrates is-a relationships for this assignment; pricing composition is retained for changes that do not fit the type hierarchy.</w:t>
+      </w:r>
+    </w:p>
+    <w:p>
+      <w:r>
+        <w:rPr>
+          <w:b/>
+        </w:rPr>
+        <w:t>Alternative solution pseudocode:</w:t>
+      </w:r>
+    </w:p>
+    <w:p>
+      <w:pPr>
+        <w:keepNext/>
+        <w:spacing w:after="0" w:line="240" w:lineRule="auto"/>
+      </w:pPr>
+      <w:r>
+        <w:t>ALTERNATIVE PSEUDOCODE</w:t>
+      </w:r>
+    </w:p>
+    <w:p>
+      <w:pPr>
+        <w:keepNext/>
+        <w:spacing w:after="0" w:line="240" w:lineRule="auto"/>
+      </w:pPr>
+      <w:r>
+        <w:t>carType &lt;- VehicleType(name="CAR", hourlyRate=30)</w:t>
+      </w:r>
+    </w:p>
+    <w:p>
+      <w:pPr>
+        <w:keepNext/>
+        <w:spacing w:after="0" w:line="240" w:lineRule="auto"/>
+      </w:pPr>
+      <w:r>
+        <w:t>vehicle &lt;- Vehicle(regNo="TN01A1", type=carType)</w:t>
+      </w:r>
+    </w:p>
+    <w:p>
+      <w:pPr>
+        <w:keepNext/>
+        <w:spacing w:after="0" w:line="240" w:lineRule="auto"/>
+      </w:pPr>
+      <w:r>
+        <w:t>FUNCTION calculateFee(vehicle, minutes)</w:t>
+      </w:r>
+    </w:p>
+    <w:p>
+      <w:pPr>
+        <w:keepNext/>
+        <w:spacing w:after="0" w:line="240" w:lineRule="auto"/>
+      </w:pPr>
+      <w:r>
+        <w:t>BEGIN</w:t>
+      </w:r>
+    </w:p>
+    <w:p>
+      <w:pPr>
+        <w:keepNext/>
+        <w:spacing w:after="0" w:line="240" w:lineRule="auto"/>
+      </w:pPr>
+      <w:r>
+        <w:t xml:space="preserve">  IF minutes &lt; 0 THEN REJECT ENDIF</w:t>
+      </w:r>
+    </w:p>
+    <w:p>
+      <w:pPr>
+        <w:keepNext/>
+        <w:spacing w:after="0" w:line="240" w:lineRule="auto"/>
+      </w:pPr>
+      <w:r>
+        <w:t xml:space="preserve">  hours &lt;- minutes DIV 60</w:t>
+      </w:r>
+    </w:p>
+    <w:p>
+      <w:pPr>
+        <w:keepNext/>
+        <w:spacing w:after="0" w:line="240" w:lineRule="auto"/>
+      </w:pPr>
+      <w:r>
+        <w:t xml:space="preserve">  IF minutes MOD 60 &gt; 0 THEN hours &lt;- hours + 1 ENDIF</w:t>
+      </w:r>
+    </w:p>
+    <w:p>
+      <w:pPr>
+        <w:keepNext/>
+        <w:spacing w:after="0" w:line="240" w:lineRule="auto"/>
+      </w:pPr>
+      <w:r>
+        <w:t xml:space="preserve">  RETURN hours * vehicle.type.hourlyRate</w:t>
+      </w:r>
+    </w:p>
+    <w:p>
+      <w:pPr>
+        <w:keepNext/>
+        <w:spacing w:after="0" w:line="240" w:lineRule="auto"/>
+      </w:pPr>
+      <w:r>
+        <w:t>END</w:t>
+      </w:r>
+    </w:p>
+    <w:p>
+      <w:pPr>
+        <w:keepNext/>
+        <w:spacing w:after="0" w:line="240" w:lineRule="auto"/>
+      </w:pPr>
+      <w:r>
+        <w:t>New simple category: add an immutable VehicleType</w:t>
+      </w:r>
+    </w:p>
+    <w:p>
+      <w:pPr>
+        <w:keepNext w:val="0"/>
+        <w:spacing w:after="0" w:line="240" w:lineRule="auto"/>
+      </w:pPr>
+      <w:r>
+        <w:t>and share it among vehicles of that category.</w:t>
       </w:r>
     </w:p>
     <w:p>
@@ -1097,6 +1847,122 @@
       </w:r>
     </w:p>
     <w:p>
+      <w:r>
+        <w:rPr>
+          <w:b/>
+        </w:rPr>
+        <w:t>Alternative solution pseudocode:</w:t>
+      </w:r>
+    </w:p>
+    <w:p>
+      <w:pPr>
+        <w:keepNext/>
+        <w:spacing w:after="0" w:line="240" w:lineRule="auto"/>
+      </w:pPr>
+      <w:r>
+        <w:t>ALTERNATIVE PSEUDOCODE</w:t>
+      </w:r>
+    </w:p>
+    <w:p>
+      <w:pPr>
+        <w:keepNext/>
+        <w:spacing w:after="0" w:line="240" w:lineRule="auto"/>
+      </w:pPr>
+      <w:r>
+        <w:t>FUNCTION rateFor(type)</w:t>
+      </w:r>
+    </w:p>
+    <w:p>
+      <w:pPr>
+        <w:keepNext/>
+        <w:spacing w:after="0" w:line="240" w:lineRule="auto"/>
+      </w:pPr>
+      <w:r>
+        <w:t>BEGIN</w:t>
+      </w:r>
+    </w:p>
+    <w:p>
+      <w:pPr>
+        <w:keepNext/>
+        <w:spacing w:after="0" w:line="240" w:lineRule="auto"/>
+      </w:pPr>
+      <w:r>
+        <w:t xml:space="preserve">  SWITCH type</w:t>
+      </w:r>
+    </w:p>
+    <w:p>
+      <w:pPr>
+        <w:keepNext/>
+        <w:spacing w:after="0" w:line="240" w:lineRule="auto"/>
+      </w:pPr>
+      <w:r>
+        <w:t xml:space="preserve">    CASE TWO_WHEELER: RETURN 10</w:t>
+      </w:r>
+    </w:p>
+    <w:p>
+      <w:pPr>
+        <w:keepNext/>
+        <w:spacing w:after="0" w:line="240" w:lineRule="auto"/>
+      </w:pPr>
+      <w:r>
+        <w:t xml:space="preserve">    CASE CAR: RETURN 30</w:t>
+      </w:r>
+    </w:p>
+    <w:p>
+      <w:pPr>
+        <w:keepNext/>
+        <w:spacing w:after="0" w:line="240" w:lineRule="auto"/>
+      </w:pPr>
+      <w:r>
+        <w:t xml:space="preserve">    CASE ELECTRIC_CAR: RETURN 30</w:t>
+      </w:r>
+    </w:p>
+    <w:p>
+      <w:pPr>
+        <w:keepNext/>
+        <w:spacing w:after="0" w:line="240" w:lineRule="auto"/>
+      </w:pPr>
+      <w:r>
+        <w:t xml:space="preserve">    DEFAULT: REJECT unknown type</w:t>
+      </w:r>
+    </w:p>
+    <w:p>
+      <w:pPr>
+        <w:keepNext/>
+        <w:spacing w:after="0" w:line="240" w:lineRule="auto"/>
+      </w:pPr>
+      <w:r>
+        <w:t xml:space="preserve">  END SWITCH</w:t>
+      </w:r>
+    </w:p>
+    <w:p>
+      <w:pPr>
+        <w:keepNext/>
+        <w:spacing w:after="0" w:line="240" w:lineRule="auto"/>
+      </w:pPr>
+      <w:r>
+        <w:t>END</w:t>
+      </w:r>
+    </w:p>
+    <w:p>
+      <w:pPr>
+        <w:keepNext/>
+        <w:spacing w:after="0" w:line="240" w:lineRule="auto"/>
+      </w:pPr>
+      <w:r>
+        <w:t>fee &lt;- ceilingHours(minutes) * rateFor(vehicle.type)</w:t>
+      </w:r>
+    </w:p>
+    <w:p>
+      <w:pPr>
+        <w:keepNext w:val="0"/>
+        <w:spacing w:after="0" w:line="240" w:lineRule="auto"/>
+      </w:pPr>
+      <w:r>
+        <w:t>A new category requires a new case and input mapping.</w:t>
+      </w:r>
+    </w:p>
+    <w:p>
       <w:pPr>
         <w:pStyle w:val="Heading1"/>
         <w:pageBreakBefore/>
@@ -1110,7 +1976,7 @@
         <w:rPr>
           <w:b w:val="0"/>
         </w:rPr>
-        <w:t>Task08.java contains the completed fee program, with the supplied main executable statements preserved. Integer division and remainder calculate ceiling hours without floating arithmetic or minutes+59 overflow. For 130 minutes there are three billable hours: TwoWheeler 3*10=30.0, Car 3*30=90.0, ElectricCar 3*30 + 10*12=210.0. Every executed output line matches the four supplied expected lines, including true.</w:t>
+        <w:t>FeeDemo.java contains the completed supplied fee program, with its original public class name and main executable statements preserved. Task08.java is a task-numbered launcher which calls FeeDemo.main(args). Integer division and remainder calculate ceiling hours without floating arithmetic or minutes+59 overflow. For 130 minutes there are three billable hours: TwoWheeler 3*10=30.0, Car 3*30=90.0, ElectricCar 3*30 + 10*12=210.0. Every executed output line matches the four supplied expected lines, including true.</w:t>
       </w:r>
     </w:p>
     <w:p>
@@ -1146,14 +2012,128 @@
       </w:r>
     </w:p>
     <w:p>
-      <w:pPr>
-        <w:keepNext/>
-      </w:pPr>
       <w:r>
         <w:rPr>
           <w:b/>
         </w:rPr>
-        <w:t>Task08.java</w:t>
+        <w:t>Alternative solution pseudocode:</w:t>
+      </w:r>
+    </w:p>
+    <w:p>
+      <w:pPr>
+        <w:keepNext/>
+        <w:spacing w:after="0" w:line="240" w:lineRule="auto"/>
+      </w:pPr>
+      <w:r>
+        <w:t>ALTERNATIVE PSEUDOCODE</w:t>
+      </w:r>
+    </w:p>
+    <w:p>
+      <w:pPr>
+        <w:keepNext/>
+        <w:spacing w:after="0" w:line="240" w:lineRule="auto"/>
+      </w:pPr>
+      <w:r>
+        <w:t>INPUT vehicle, minutes, kWh</w:t>
+      </w:r>
+    </w:p>
+    <w:p>
+      <w:pPr>
+        <w:keepNext/>
+        <w:spacing w:after="0" w:line="240" w:lineRule="auto"/>
+      </w:pPr>
+      <w:r>
+        <w:t>BEGIN</w:t>
+      </w:r>
+    </w:p>
+    <w:p>
+      <w:pPr>
+        <w:keepNext/>
+        <w:spacing w:after="0" w:line="240" w:lineRule="auto"/>
+      </w:pPr>
+      <w:r>
+        <w:t xml:space="preserve">  IF vehicle IS ElectricCar THEN</w:t>
+      </w:r>
+    </w:p>
+    <w:p>
+      <w:pPr>
+        <w:keepNext/>
+        <w:spacing w:after="0" w:line="240" w:lineRule="auto"/>
+      </w:pPr>
+      <w:r>
+        <w:t xml:space="preserve">    RETURN ceilingHours(minutes) * 30 + kWh * 12</w:t>
+      </w:r>
+    </w:p>
+    <w:p>
+      <w:pPr>
+        <w:keepNext/>
+        <w:spacing w:after="0" w:line="240" w:lineRule="auto"/>
+      </w:pPr>
+      <w:r>
+        <w:t xml:space="preserve">  ELSE IF vehicle IS Car THEN</w:t>
+      </w:r>
+    </w:p>
+    <w:p>
+      <w:pPr>
+        <w:keepNext/>
+        <w:spacing w:after="0" w:line="240" w:lineRule="auto"/>
+      </w:pPr>
+      <w:r>
+        <w:t xml:space="preserve">    RETURN ceilingHours(minutes) * 30</w:t>
+      </w:r>
+    </w:p>
+    <w:p>
+      <w:pPr>
+        <w:keepNext/>
+        <w:spacing w:after="0" w:line="240" w:lineRule="auto"/>
+      </w:pPr>
+      <w:r>
+        <w:t xml:space="preserve">  ELSE IF vehicle IS TwoWheeler THEN</w:t>
+      </w:r>
+    </w:p>
+    <w:p>
+      <w:pPr>
+        <w:keepNext/>
+        <w:spacing w:after="0" w:line="240" w:lineRule="auto"/>
+      </w:pPr>
+      <w:r>
+        <w:t xml:space="preserve">    RETURN ceilingHours(minutes) * 10</w:t>
+      </w:r>
+    </w:p>
+    <w:p>
+      <w:pPr>
+        <w:keepNext/>
+        <w:spacing w:after="0" w:line="240" w:lineRule="auto"/>
+      </w:pPr>
+      <w:r>
+        <w:t xml:space="preserve">  ELSE</w:t>
+      </w:r>
+    </w:p>
+    <w:p>
+      <w:pPr>
+        <w:keepNext/>
+        <w:spacing w:after="0" w:line="240" w:lineRule="auto"/>
+      </w:pPr>
+      <w:r>
+        <w:t xml:space="preserve">    REJECT unknown vehicle type</w:t>
+      </w:r>
+    </w:p>
+    <w:p>
+      <w:pPr>
+        <w:keepNext/>
+        <w:spacing w:after="0" w:line="240" w:lineRule="auto"/>
+      </w:pPr>
+      <w:r>
+        <w:t xml:space="preserve">  ENDIF</w:t>
+      </w:r>
+    </w:p>
+    <w:p>
+      <w:pPr>
+        <w:keepNext/>
+        <w:spacing w:after="0" w:line="240" w:lineRule="auto"/>
+      </w:pPr>
+      <w:r>
+        <w:t>END</w:t>
       </w:r>
     </w:p>
     <w:p>
@@ -1162,7 +2142,18 @@
         <w:spacing w:after="0" w:line="240" w:lineRule="auto"/>
       </w:pPr>
       <w:r>
-        <w:t>interface Chargeable {</w:t>
+        <w:t>The subclass ElectricCar must be tested before Car.</w:t>
+      </w:r>
+    </w:p>
+    <w:p>
+      <w:pPr>
+        <w:keepNext/>
+      </w:pPr>
+      <w:r>
+        <w:rPr>
+          <w:b/>
+        </w:rPr>
+        <w:t>FeeDemo.java</w:t>
       </w:r>
     </w:p>
     <w:p>
@@ -1171,7 +2162,7 @@
         <w:spacing w:after="0" w:line="240" w:lineRule="auto"/>
       </w:pPr>
       <w:r>
-        <w:t xml:space="preserve">    double chargingFee(int kWh);</w:t>
+        <w:t>interface Chargeable {</w:t>
       </w:r>
     </w:p>
     <w:p>
@@ -1180,7 +2171,7 @@
         <w:spacing w:after="0" w:line="240" w:lineRule="auto"/>
       </w:pPr>
       <w:r>
-        <w:t>}</w:t>
+        <w:t xml:space="preserve">    double chargingFee(int kWh);</w:t>
       </w:r>
     </w:p>
     <w:p>
@@ -1189,7 +2180,7 @@
         <w:spacing w:after="0" w:line="240" w:lineRule="auto"/>
       </w:pPr>
       <w:r>
-        <w:t>abstract class Vehicle {</w:t>
+        <w:t>}</w:t>
       </w:r>
     </w:p>
     <w:p>
@@ -1198,7 +2189,7 @@
         <w:spacing w:after="0" w:line="240" w:lineRule="auto"/>
       </w:pPr>
       <w:r>
-        <w:t xml:space="preserve">    private final String regNo;</w:t>
+        <w:t>abstract class Vehicle {</w:t>
       </w:r>
     </w:p>
     <w:p>
@@ -1207,7 +2198,7 @@
         <w:spacing w:after="0" w:line="240" w:lineRule="auto"/>
       </w:pPr>
       <w:r>
-        <w:t xml:space="preserve">    protected Vehicle(String regNo) { this.regNo = regNo; }</w:t>
+        <w:t xml:space="preserve">    private final String regNo;</w:t>
       </w:r>
     </w:p>
     <w:p>
@@ -1216,7 +2207,7 @@
         <w:spacing w:after="0" w:line="240" w:lineRule="auto"/>
       </w:pPr>
       <w:r>
-        <w:t xml:space="preserve">    public String getRegNo() { return regNo; }</w:t>
+        <w:t xml:space="preserve">    protected Vehicle(String regNo) { this.regNo = regNo; }</w:t>
       </w:r>
     </w:p>
     <w:p>
@@ -1225,7 +2216,7 @@
         <w:spacing w:after="0" w:line="240" w:lineRule="auto"/>
       </w:pPr>
       <w:r>
-        <w:t xml:space="preserve">    protected abstract double ratePerHour();</w:t>
+        <w:t xml:space="preserve">    public String getRegNo() { return regNo; }</w:t>
       </w:r>
     </w:p>
     <w:p>
@@ -1234,7 +2225,7 @@
         <w:spacing w:after="0" w:line="240" w:lineRule="auto"/>
       </w:pPr>
       <w:r>
-        <w:t xml:space="preserve">    public double calculateFee(int minutes) {</w:t>
+        <w:t xml:space="preserve">    protected abstract double ratePerHour();</w:t>
       </w:r>
     </w:p>
     <w:p>
@@ -1243,7 +2234,7 @@
         <w:spacing w:after="0" w:line="240" w:lineRule="auto"/>
       </w:pPr>
       <w:r>
-        <w:t xml:space="preserve">        int hours = minutes / 60 + (minutes % 60 == 0 ? 0 : 1);</w:t>
+        <w:t xml:space="preserve">    public double calculateFee(int minutes) {</w:t>
       </w:r>
     </w:p>
     <w:p>
@@ -1252,7 +2243,7 @@
         <w:spacing w:after="0" w:line="240" w:lineRule="auto"/>
       </w:pPr>
       <w:r>
-        <w:t xml:space="preserve">        return hours * ratePerHour();</w:t>
+        <w:t xml:space="preserve">        int hours = minutes / 60 + (minutes % 60 == 0 ? 0 : 1);</w:t>
       </w:r>
     </w:p>
     <w:p>
@@ -1261,7 +2252,7 @@
         <w:spacing w:after="0" w:line="240" w:lineRule="auto"/>
       </w:pPr>
       <w:r>
-        <w:t xml:space="preserve">    }</w:t>
+        <w:t xml:space="preserve">        return hours * ratePerHour();</w:t>
       </w:r>
     </w:p>
     <w:p>
@@ -1270,7 +2261,7 @@
         <w:spacing w:after="0" w:line="240" w:lineRule="auto"/>
       </w:pPr>
       <w:r>
-        <w:t xml:space="preserve">    @Override public boolean equals(Object o) {</w:t>
+        <w:t xml:space="preserve">    }</w:t>
       </w:r>
     </w:p>
     <w:p>
@@ -1279,7 +2270,7 @@
         <w:spacing w:after="0" w:line="240" w:lineRule="auto"/>
       </w:pPr>
       <w:r>
-        <w:t xml:space="preserve">        return o instanceof Vehicle &amp;&amp; regNo.equals(((Vehicle) o).regNo);</w:t>
+        <w:t xml:space="preserve">    @Override public boolean equals(Object o) {</w:t>
       </w:r>
     </w:p>
     <w:p>
@@ -1288,7 +2279,7 @@
         <w:spacing w:after="0" w:line="240" w:lineRule="auto"/>
       </w:pPr>
       <w:r>
-        <w:t xml:space="preserve">    }</w:t>
+        <w:t xml:space="preserve">        return o instanceof Vehicle &amp;&amp; regNo.equals(((Vehicle) o).regNo);</w:t>
       </w:r>
     </w:p>
     <w:p>
@@ -1297,7 +2288,7 @@
         <w:spacing w:after="0" w:line="240" w:lineRule="auto"/>
       </w:pPr>
       <w:r>
-        <w:t xml:space="preserve">    @Override public int hashCode() { return regNo.hashCode(); }</w:t>
+        <w:t xml:space="preserve">    }</w:t>
       </w:r>
     </w:p>
     <w:p>
@@ -1306,7 +2297,7 @@
         <w:spacing w:after="0" w:line="240" w:lineRule="auto"/>
       </w:pPr>
       <w:r>
-        <w:t>}</w:t>
+        <w:t xml:space="preserve">    @Override public int hashCode() { return regNo.hashCode(); }</w:t>
       </w:r>
     </w:p>
     <w:p>
@@ -1315,7 +2306,7 @@
         <w:spacing w:after="0" w:line="240" w:lineRule="auto"/>
       </w:pPr>
       <w:r>
-        <w:t>class TwoWheeler extends Vehicle {</w:t>
+        <w:t>}</w:t>
       </w:r>
     </w:p>
     <w:p>
@@ -1324,7 +2315,7 @@
         <w:spacing w:after="0" w:line="240" w:lineRule="auto"/>
       </w:pPr>
       <w:r>
-        <w:t xml:space="preserve">    TwoWheeler(String regNo) { super(regNo); }</w:t>
+        <w:t>class TwoWheeler extends Vehicle {</w:t>
       </w:r>
     </w:p>
     <w:p>
@@ -1333,7 +2324,7 @@
         <w:spacing w:after="0" w:line="240" w:lineRule="auto"/>
       </w:pPr>
       <w:r>
-        <w:t xml:space="preserve">    @Override protected double ratePerHour() { return 10; }</w:t>
+        <w:t xml:space="preserve">    TwoWheeler(String regNo) { super(regNo); }</w:t>
       </w:r>
     </w:p>
     <w:p>
@@ -1342,7 +2333,7 @@
         <w:spacing w:after="0" w:line="240" w:lineRule="auto"/>
       </w:pPr>
       <w:r>
-        <w:t>}</w:t>
+        <w:t xml:space="preserve">    @Override protected double ratePerHour() { return 10; }</w:t>
       </w:r>
     </w:p>
     <w:p>
@@ -1351,7 +2342,7 @@
         <w:spacing w:after="0" w:line="240" w:lineRule="auto"/>
       </w:pPr>
       <w:r>
-        <w:t>class Car extends Vehicle {</w:t>
+        <w:t>}</w:t>
       </w:r>
     </w:p>
     <w:p>
@@ -1360,7 +2351,7 @@
         <w:spacing w:after="0" w:line="240" w:lineRule="auto"/>
       </w:pPr>
       <w:r>
-        <w:t xml:space="preserve">    Car(String regNo) { super(regNo); }</w:t>
+        <w:t>class Car extends Vehicle {</w:t>
       </w:r>
     </w:p>
     <w:p>
@@ -1369,7 +2360,7 @@
         <w:spacing w:after="0" w:line="240" w:lineRule="auto"/>
       </w:pPr>
       <w:r>
-        <w:t xml:space="preserve">    @Override protected double ratePerHour() { return 30; }</w:t>
+        <w:t xml:space="preserve">    Car(String regNo) { super(regNo); }</w:t>
       </w:r>
     </w:p>
     <w:p>
@@ -1378,7 +2369,7 @@
         <w:spacing w:after="0" w:line="240" w:lineRule="auto"/>
       </w:pPr>
       <w:r>
-        <w:t>}</w:t>
+        <w:t xml:space="preserve">    @Override protected double ratePerHour() { return 30; }</w:t>
       </w:r>
     </w:p>
     <w:p>
@@ -1387,7 +2378,7 @@
         <w:spacing w:after="0" w:line="240" w:lineRule="auto"/>
       </w:pPr>
       <w:r>
-        <w:t>class ElectricCar extends Car implements Chargeable {</w:t>
+        <w:t>}</w:t>
       </w:r>
     </w:p>
     <w:p>
@@ -1396,7 +2387,7 @@
         <w:spacing w:after="0" w:line="240" w:lineRule="auto"/>
       </w:pPr>
       <w:r>
-        <w:t xml:space="preserve">    ElectricCar(String regNo) { super(regNo); }</w:t>
+        <w:t>class ElectricCar extends Car implements Chargeable {</w:t>
       </w:r>
     </w:p>
     <w:p>
@@ -1405,7 +2396,7 @@
         <w:spacing w:after="0" w:line="240" w:lineRule="auto"/>
       </w:pPr>
       <w:r>
-        <w:t xml:space="preserve">    public double chargingFee(int kWh) { return 12.0 * kWh; }</w:t>
+        <w:t xml:space="preserve">    ElectricCar(String regNo) { super(regNo); }</w:t>
       </w:r>
     </w:p>
     <w:p>
@@ -1414,7 +2405,7 @@
         <w:spacing w:after="0" w:line="240" w:lineRule="auto"/>
       </w:pPr>
       <w:r>
-        <w:t>}</w:t>
+        <w:t xml:space="preserve">    public double chargingFee(int kWh) { return 12.0 * kWh; }</w:t>
       </w:r>
     </w:p>
     <w:p>
@@ -1423,7 +2414,16 @@
         <w:spacing w:after="0" w:line="240" w:lineRule="auto"/>
       </w:pPr>
       <w:r>
-        <w:t>public class Task08 {</w:t>
+        <w:t>}</w:t>
+      </w:r>
+    </w:p>
+    <w:p>
+      <w:pPr>
+        <w:keepNext w:val="0"/>
+        <w:spacing w:after="0" w:line="240" w:lineRule="auto"/>
+      </w:pPr>
+      <w:r>
+        <w:t>public class FeeDemo {</w:t>
       </w:r>
     </w:p>
     <w:p>
@@ -1700,6 +2700,158 @@
       </w:r>
     </w:p>
     <w:p>
+      <w:r>
+        <w:rPr>
+          <w:b/>
+        </w:rPr>
+        <w:t>Alternative solution pseudocode:</w:t>
+      </w:r>
+    </w:p>
+    <w:p>
+      <w:pPr>
+        <w:keepNext/>
+        <w:spacing w:after="0" w:line="240" w:lineRule="auto"/>
+      </w:pPr>
+      <w:r>
+        <w:t>ALTERNATIVE PSEUDOCODE</w:t>
+      </w:r>
+    </w:p>
+    <w:p>
+      <w:pPr>
+        <w:keepNext/>
+        <w:spacing w:after="0" w:line="240" w:lineRule="auto"/>
+      </w:pPr>
+      <w:r>
+        <w:t>DEFINE INTERFACE VehicleContract</w:t>
+      </w:r>
+    </w:p>
+    <w:p>
+      <w:pPr>
+        <w:keepNext/>
+        <w:spacing w:after="0" w:line="240" w:lineRule="auto"/>
+      </w:pPr>
+      <w:r>
+        <w:t xml:space="preserve">  REQUIRE getRegNo()</w:t>
+      </w:r>
+    </w:p>
+    <w:p>
+      <w:pPr>
+        <w:keepNext/>
+        <w:spacing w:after="0" w:line="240" w:lineRule="auto"/>
+      </w:pPr>
+      <w:r>
+        <w:t xml:space="preserve">  REQUIRE hourlyRate()</w:t>
+      </w:r>
+    </w:p>
+    <w:p>
+      <w:pPr>
+        <w:keepNext/>
+        <w:spacing w:after="0" w:line="240" w:lineRule="auto"/>
+      </w:pPr>
+      <w:r>
+        <w:t xml:space="preserve">  DEFAULT calculateFee(minutes):</w:t>
+      </w:r>
+    </w:p>
+    <w:p>
+      <w:pPr>
+        <w:keepNext/>
+        <w:spacing w:after="0" w:line="240" w:lineRule="auto"/>
+      </w:pPr>
+      <w:r>
+        <w:t xml:space="preserve">    RETURN ceilingHours(minutes) * hourlyRate()</w:t>
+      </w:r>
+    </w:p>
+    <w:p>
+      <w:pPr>
+        <w:keepNext/>
+        <w:spacing w:after="0" w:line="240" w:lineRule="auto"/>
+      </w:pPr>
+      <w:r>
+        <w:t>END INTERFACE</w:t>
+      </w:r>
+    </w:p>
+    <w:p>
+      <w:pPr>
+        <w:keepNext/>
+        <w:spacing w:after="0" w:line="240" w:lineRule="auto"/>
+      </w:pPr>
+      <w:r>
+        <w:t>DEFINE ABSTRACT CLASS ChargingBase</w:t>
+      </w:r>
+    </w:p>
+    <w:p>
+      <w:pPr>
+        <w:keepNext/>
+        <w:spacing w:after="0" w:line="240" w:lineRule="auto"/>
+      </w:pPr>
+      <w:r>
+        <w:t xml:space="preserve">  STORE chargingRate</w:t>
+      </w:r>
+    </w:p>
+    <w:p>
+      <w:pPr>
+        <w:keepNext/>
+        <w:spacing w:after="0" w:line="240" w:lineRule="auto"/>
+      </w:pPr>
+      <w:r>
+        <w:t xml:space="preserve">  CONSTRUCTOR(rate): validate and store rate</w:t>
+      </w:r>
+    </w:p>
+    <w:p>
+      <w:pPr>
+        <w:keepNext/>
+        <w:spacing w:after="0" w:line="240" w:lineRule="auto"/>
+      </w:pPr>
+      <w:r>
+        <w:t xml:space="preserve">  chargingFee(kWh): RETURN kWh * chargingRate</w:t>
+      </w:r>
+    </w:p>
+    <w:p>
+      <w:pPr>
+        <w:keepNext/>
+        <w:spacing w:after="0" w:line="240" w:lineRule="auto"/>
+      </w:pPr>
+      <w:r>
+        <w:t>END CLASS</w:t>
+      </w:r>
+    </w:p>
+    <w:p>
+      <w:pPr>
+        <w:keepNext/>
+        <w:spacing w:after="0" w:line="240" w:lineRule="auto"/>
+      </w:pPr>
+      <w:r>
+        <w:t>Each vehicle implementation must supply its own identity</w:t>
+      </w:r>
+    </w:p>
+    <w:p>
+      <w:pPr>
+        <w:keepNext/>
+        <w:spacing w:after="0" w:line="240" w:lineRule="auto"/>
+      </w:pPr>
+      <w:r>
+        <w:t>state and validation, or delegate to a shared object.</w:t>
+      </w:r>
+    </w:p>
+    <w:p>
+      <w:pPr>
+        <w:keepNext/>
+        <w:spacing w:after="0" w:line="240" w:lineRule="auto"/>
+      </w:pPr>
+      <w:r>
+        <w:t>An electric car cannot extend both Car and ChargingBase;</w:t>
+      </w:r>
+    </w:p>
+    <w:p>
+      <w:pPr>
+        <w:keepNext w:val="0"/>
+        <w:spacing w:after="0" w:line="240" w:lineRule="auto"/>
+      </w:pPr>
+      <w:r>
+        <w:t>use composition with a charger or replace the Car base.</w:t>
+      </w:r>
+    </w:p>
+    <w:p>
       <w:pPr>
         <w:pStyle w:val="Heading1"/>
         <w:pageBreakBefore/>
@@ -1749,6 +2901,113 @@
       </w:r>
     </w:p>
     <w:p>
+      <w:r>
+        <w:rPr>
+          <w:b/>
+        </w:rPr>
+        <w:t>Alternative solution pseudocode:</w:t>
+      </w:r>
+    </w:p>
+    <w:p>
+      <w:pPr>
+        <w:keepNext/>
+        <w:spacing w:after="0" w:line="240" w:lineRule="auto"/>
+      </w:pPr>
+      <w:r>
+        <w:t>ALTERNATIVE PSEUDOCODE</w:t>
+      </w:r>
+    </w:p>
+    <w:p>
+      <w:pPr>
+        <w:keepNext/>
+        <w:spacing w:after="0" w:line="240" w:lineRule="auto"/>
+      </w:pPr>
+      <w:r>
+        <w:t>Public-slot design, in every calling method:</w:t>
+      </w:r>
+    </w:p>
+    <w:p>
+      <w:pPr>
+        <w:keepNext/>
+        <w:spacing w:after="0" w:line="240" w:lineRule="auto"/>
+      </w:pPr>
+      <w:r>
+        <w:t>BEGIN</w:t>
+      </w:r>
+    </w:p>
+    <w:p>
+      <w:pPr>
+        <w:keepNext/>
+        <w:spacing w:after="0" w:line="240" w:lineRule="auto"/>
+      </w:pPr>
+      <w:r>
+        <w:t xml:space="preserve">  IF requestedVehicle = null THEN REJECT ENDIF</w:t>
+      </w:r>
+    </w:p>
+    <w:p>
+      <w:pPr>
+        <w:keepNext/>
+        <w:spacing w:after="0" w:line="240" w:lineRule="auto"/>
+      </w:pPr>
+      <w:r>
+        <w:t xml:space="preserve">  IF publicSlot.vehicle != null THEN REJECT ENDIF</w:t>
+      </w:r>
+    </w:p>
+    <w:p>
+      <w:pPr>
+        <w:keepNext/>
+        <w:spacing w:after="0" w:line="240" w:lineRule="auto"/>
+      </w:pPr>
+      <w:r>
+        <w:t xml:space="preserve">  publicSlot.vehicle &lt;- requestedVehicle</w:t>
+      </w:r>
+    </w:p>
+    <w:p>
+      <w:pPr>
+        <w:keepNext/>
+        <w:spacing w:after="0" w:line="240" w:lineRule="auto"/>
+      </w:pPr>
+      <w:r>
+        <w:t>END</w:t>
+      </w:r>
+    </w:p>
+    <w:p>
+      <w:pPr>
+        <w:keepNext/>
+        <w:spacing w:after="0" w:line="240" w:lineRule="auto"/>
+      </w:pPr>
+      <w:r>
+        <w:t>Another caller must repeat both checks before assignment.</w:t>
+      </w:r>
+    </w:p>
+    <w:p>
+      <w:pPr>
+        <w:keepNext/>
+        <w:spacing w:after="0" w:line="240" w:lineRule="auto"/>
+      </w:pPr>
+      <w:r>
+        <w:t>Encapsulated design:</w:t>
+      </w:r>
+    </w:p>
+    <w:p>
+      <w:pPr>
+        <w:keepNext/>
+        <w:spacing w:after="0" w:line="240" w:lineRule="auto"/>
+      </w:pPr>
+      <w:r>
+        <w:t xml:space="preserve">  slot.occupy(requestedVehicle)</w:t>
+      </w:r>
+    </w:p>
+    <w:p>
+      <w:pPr>
+        <w:keepNext w:val="0"/>
+        <w:spacing w:after="0" w:line="240" w:lineRule="auto"/>
+      </w:pPr>
+      <w:r>
+        <w:t>The occupy method owns the checks in one location.</w:t>
+      </w:r>
+    </w:p>
+    <w:p>
       <w:pPr>
         <w:pStyle w:val="Heading1"/>
         <w:pageBreakBefore/>
@@ -1802,16 +3061,186 @@
         <w:rPr>
           <w:b w:val="0"/>
         </w:rPr>
-        <w:t>Task11/Task11Benchmark.java measures last-element successful lookup at n=20,150,500, 10000 warm-up and 20000 timed repetitions per structure. Each lookup result reaches a volatile sink. All structures share the same prebuilt tickets, and setup is outside timing. It measures lookup alone, not fee computation/removal or memory bytes. Results vary with JIT, CPU and run order and do not establish formal Big-O. Exact retained bytes were not measured; the space comparison is structural. Measured timings are listed below.</w:t>
+        <w:t>Task11/Task11Benchmark.java measures last-element successful lookup at n=20,150,500, 10000 warm-up and 20000 timed repetitions per structure. Each lookup result reaches a volatile sink. All structures share the same prebuilt tickets, and setup is outside timing. The timed section measures lookup alone, not fee computation or removal. Storage is measured separately after timing. Results vary with JIT, CPU and run order and do not establish formal Big-O. Task11MemoryAgent uses Java Instrumentation.getObjectSize to sum each collection object, its backing arrays and map nodes. Ticket, Vehicle and registration String objects are shared by all three collections and excluded from these collection-storage totals. The ArrayList is measured with its actual spare capacity; the HashMap includes its bucket array and entry nodes. These are measured JVM-specific bytes, not estimates of whole-process heap use. The java.util package is opened only for this measurement run so the helper can follow collection backing fields. Measured timings are listed below.</w:t>
       </w:r>
     </w:p>
     <w:p>
       <w:r>
         <w:rPr>
-          <w:b w:val="0"/>
+          <w:b/>
         </w:rPr>
-        <w:br/>
-        <w:t>GitHub repository: https://github.com/192521143simats-sketch/CSA09-192521143-Assignment1</w:t>
+        <w:t>Alternative solution pseudocode:</w:t>
+      </w:r>
+    </w:p>
+    <w:p>
+      <w:pPr>
+        <w:keepNext/>
+        <w:spacing w:after="0" w:line="240" w:lineRule="auto"/>
+      </w:pPr>
+      <w:r>
+        <w:t>ALTERNATIVE PSEUDOCODE</w:t>
+      </w:r>
+    </w:p>
+    <w:p>
+      <w:pPr>
+        <w:keepNext/>
+        <w:spacing w:after="0" w:line="240" w:lineRule="auto"/>
+      </w:pPr>
+      <w:r>
+        <w:t>ArrayList exit:</w:t>
+      </w:r>
+    </w:p>
+    <w:p>
+      <w:pPr>
+        <w:keepNext/>
+        <w:spacing w:after="0" w:line="240" w:lineRule="auto"/>
+      </w:pPr>
+      <w:r>
+        <w:t xml:space="preserve">  FOR i FROM 0 TO activeList.size - 1 DO</w:t>
+      </w:r>
+    </w:p>
+    <w:p>
+      <w:pPr>
+        <w:keepNext/>
+        <w:spacing w:after="0" w:line="240" w:lineRule="auto"/>
+      </w:pPr>
+      <w:r>
+        <w:t xml:space="preserve">    IF activeList[i].registration = requestedReg THEN</w:t>
+      </w:r>
+    </w:p>
+    <w:p>
+      <w:pPr>
+        <w:keepNext/>
+        <w:spacing w:after="0" w:line="240" w:lineRule="auto"/>
+      </w:pPr>
+      <w:r>
+        <w:t xml:space="preserve">      ticket &lt;- activeList[i]</w:t>
+      </w:r>
+    </w:p>
+    <w:p>
+      <w:pPr>
+        <w:keepNext/>
+        <w:spacing w:after="0" w:line="240" w:lineRule="auto"/>
+      </w:pPr>
+      <w:r>
+        <w:t xml:space="preserve">      validate exit and calculate fee</w:t>
+      </w:r>
+    </w:p>
+    <w:p>
+      <w:pPr>
+        <w:keepNext/>
+        <w:spacing w:after="0" w:line="240" w:lineRule="auto"/>
+      </w:pPr>
+      <w:r>
+        <w:t xml:space="preserve">      release ticket.slot</w:t>
+      </w:r>
+    </w:p>
+    <w:p>
+      <w:pPr>
+        <w:keepNext/>
+        <w:spacing w:after="0" w:line="240" w:lineRule="auto"/>
+      </w:pPr>
+      <w:r>
+        <w:t xml:space="preserve">      activeList.remove(i)</w:t>
+      </w:r>
+    </w:p>
+    <w:p>
+      <w:pPr>
+        <w:keepNext/>
+        <w:spacing w:after="0" w:line="240" w:lineRule="auto"/>
+      </w:pPr>
+      <w:r>
+        <w:t xml:space="preserve">      RETURN fee</w:t>
+      </w:r>
+    </w:p>
+    <w:p>
+      <w:pPr>
+        <w:keepNext/>
+        <w:spacing w:after="0" w:line="240" w:lineRule="auto"/>
+      </w:pPr>
+      <w:r>
+        <w:t xml:space="preserve">    ENDIF</w:t>
+      </w:r>
+    </w:p>
+    <w:p>
+      <w:pPr>
+        <w:keepNext/>
+        <w:spacing w:after="0" w:line="240" w:lineRule="auto"/>
+      </w:pPr>
+      <w:r>
+        <w:t xml:space="preserve">  ENDFOR</w:t>
+      </w:r>
+    </w:p>
+    <w:p>
+      <w:pPr>
+        <w:keepNext/>
+        <w:spacing w:after="0" w:line="240" w:lineRule="auto"/>
+      </w:pPr>
+      <w:r>
+        <w:t xml:space="preserve">  REJECT missing ticket</w:t>
+      </w:r>
+    </w:p>
+    <w:p>
+      <w:pPr>
+        <w:keepNext/>
+        <w:spacing w:after="0" w:line="240" w:lineRule="auto"/>
+      </w:pPr>
+      <w:r>
+        <w:t>HashMap exit:</w:t>
+      </w:r>
+    </w:p>
+    <w:p>
+      <w:pPr>
+        <w:keepNext/>
+        <w:spacing w:after="0" w:line="240" w:lineRule="auto"/>
+      </w:pPr>
+      <w:r>
+        <w:t xml:space="preserve">  ticket &lt;- activeMap.get(normalize(requestedReg))</w:t>
+      </w:r>
+    </w:p>
+    <w:p>
+      <w:pPr>
+        <w:keepNext/>
+        <w:spacing w:after="0" w:line="240" w:lineRule="auto"/>
+      </w:pPr>
+      <w:r>
+        <w:t xml:space="preserve">  IF ticket = null THEN REJECT missing ticket ENDIF</w:t>
+      </w:r>
+    </w:p>
+    <w:p>
+      <w:pPr>
+        <w:keepNext/>
+        <w:spacing w:after="0" w:line="240" w:lineRule="auto"/>
+      </w:pPr>
+      <w:r>
+        <w:t xml:space="preserve">  validate exit and calculate fee</w:t>
+      </w:r>
+    </w:p>
+    <w:p>
+      <w:pPr>
+        <w:keepNext/>
+        <w:spacing w:after="0" w:line="240" w:lineRule="auto"/>
+      </w:pPr>
+      <w:r>
+        <w:t xml:space="preserve">  release ticket.slot</w:t>
+      </w:r>
+    </w:p>
+    <w:p>
+      <w:pPr>
+        <w:keepNext/>
+        <w:spacing w:after="0" w:line="240" w:lineRule="auto"/>
+      </w:pPr>
+      <w:r>
+        <w:t xml:space="preserve">  activeMap.remove(normalize(requestedReg))</w:t>
+      </w:r>
+    </w:p>
+    <w:p>
+      <w:pPr>
+        <w:keepNext w:val="0"/>
+        <w:spacing w:after="0" w:line="240" w:lineRule="auto"/>
+      </w:pPr>
+      <w:r>
+        <w:t xml:space="preserve">  RETURN fee</w:t>
       </w:r>
     </w:p>
     <w:p>
@@ -5576,7 +7005,7 @@
               <w:spacing w:before="80" w:after="80" w:line="240" w:lineRule="auto"/>
             </w:pPr>
             <w:r>
-              <w:t>112</w:t>
+              <w:t>201</w:t>
             </w:r>
           </w:p>
         </w:tc>
@@ -5595,7 +7024,7 @@
               <w:spacing w:before="80" w:after="80" w:line="240" w:lineRule="auto"/>
             </w:pPr>
             <w:r>
-              <w:t>288</w:t>
+              <w:t>396</w:t>
             </w:r>
           </w:p>
         </w:tc>
@@ -5614,7 +7043,7 @@
               <w:spacing w:before="80" w:after="80" w:line="240" w:lineRule="auto"/>
             </w:pPr>
             <w:r>
-              <w:t>63</w:t>
+              <w:t>240</w:t>
             </w:r>
           </w:p>
         </w:tc>
@@ -5657,7 +7086,7 @@
               <w:spacing w:before="80" w:after="80" w:line="240" w:lineRule="auto"/>
             </w:pPr>
             <w:r>
-              <w:t>462</w:t>
+              <w:t>830</w:t>
             </w:r>
           </w:p>
         </w:tc>
@@ -5676,7 +7105,7 @@
               <w:spacing w:before="80" w:after="80" w:line="240" w:lineRule="auto"/>
             </w:pPr>
             <w:r>
-              <w:t>514</w:t>
+              <w:t>1011</w:t>
             </w:r>
           </w:p>
         </w:tc>
@@ -5695,7 +7124,7 @@
               <w:spacing w:before="80" w:after="80" w:line="240" w:lineRule="auto"/>
             </w:pPr>
             <w:r>
-              <w:t>22</w:t>
+              <w:t>26</w:t>
             </w:r>
           </w:p>
         </w:tc>
@@ -5738,7 +7167,7 @@
               <w:spacing w:before="80" w:after="80" w:line="240" w:lineRule="auto"/>
             </w:pPr>
             <w:r>
-              <w:t>2109</w:t>
+              <w:t>2118</w:t>
             </w:r>
           </w:p>
         </w:tc>
@@ -5757,7 +7186,7 @@
               <w:spacing w:before="80" w:after="80" w:line="240" w:lineRule="auto"/>
             </w:pPr>
             <w:r>
-              <w:t>2570</w:t>
+              <w:t>3376</w:t>
             </w:r>
           </w:p>
         </w:tc>
@@ -5776,13 +7205,375 @@
               <w:spacing w:before="80" w:after="80" w:line="240" w:lineRule="auto"/>
             </w:pPr>
             <w:r>
-              <w:t>19</w:t>
+              <w:t>25</w:t>
             </w:r>
           </w:p>
         </w:tc>
       </w:tr>
     </w:tbl>
     <w:p>
+      <w:r>
+        <w:rPr>
+          <w:b w:val="0"/>
+        </w:rPr>
+        <w:t>Measured collection storage (bytes; shared ticket/key payload excluded):</w:t>
+      </w:r>
+    </w:p>
+    <w:tbl>
+      <w:tblPr>
+        <w:tblW w:type="auto" w:w="0"/>
+        <w:tblLayout w:type="fixed"/>
+        <w:tblLook w:firstColumn="1" w:firstRow="1" w:lastColumn="0" w:lastRow="0" w:noHBand="0" w:noVBand="1" w:val="04A0"/>
+      </w:tblPr>
+      <w:tblGrid>
+        <w:gridCol w:w="1440"/>
+        <w:gridCol w:w="2520"/>
+        <w:gridCol w:w="2736"/>
+        <w:gridCol w:w="2635"/>
+      </w:tblGrid>
+      <w:tr>
+        <w:trPr>
+          <w:tblHeader/>
+          <w:cantSplit/>
+        </w:trPr>
+        <w:tc>
+          <w:tcPr>
+            <w:tcW w:type="dxa" w:w="1440"/>
+            <w:tcBorders>
+              <w:top w:val="single" w:sz="4" w:color="D9D9D9"/>
+              <w:left w:val="single" w:sz="4" w:color="D9D9D9"/>
+              <w:bottom w:val="single" w:sz="4" w:color="D9D9D9"/>
+              <w:right w:val="single" w:sz="4" w:color="D9D9D9"/>
+            </w:tcBorders>
+            <w:shd w:fill="EAEAEA"/>
+          </w:tcPr>
+          <w:p>
+            <w:pPr>
+              <w:spacing w:before="80" w:after="80" w:line="240" w:lineRule="auto"/>
+            </w:pPr>
+            <w:r>
+              <w:rPr>
+                <w:b/>
+              </w:rPr>
+              <w:t>Vehicles</w:t>
+            </w:r>
+          </w:p>
+        </w:tc>
+        <w:tc>
+          <w:tcPr>
+            <w:tcW w:type="dxa" w:w="2520"/>
+            <w:tcBorders>
+              <w:top w:val="single" w:sz="4" w:color="D9D9D9"/>
+              <w:left w:val="single" w:sz="4" w:color="D9D9D9"/>
+              <w:bottom w:val="single" w:sz="4" w:color="D9D9D9"/>
+              <w:right w:val="single" w:sz="4" w:color="D9D9D9"/>
+            </w:tcBorders>
+            <w:shd w:fill="EAEAEA"/>
+          </w:tcPr>
+          <w:p>
+            <w:pPr>
+              <w:spacing w:before="80" w:after="80" w:line="240" w:lineRule="auto"/>
+            </w:pPr>
+            <w:r>
+              <w:rPr>
+                <w:b/>
+              </w:rPr>
+              <w:t>Array</w:t>
+            </w:r>
+          </w:p>
+        </w:tc>
+        <w:tc>
+          <w:tcPr>
+            <w:tcW w:type="dxa" w:w="2736"/>
+            <w:tcBorders>
+              <w:top w:val="single" w:sz="4" w:color="D9D9D9"/>
+              <w:left w:val="single" w:sz="4" w:color="D9D9D9"/>
+              <w:bottom w:val="single" w:sz="4" w:color="D9D9D9"/>
+              <w:right w:val="single" w:sz="4" w:color="D9D9D9"/>
+            </w:tcBorders>
+            <w:shd w:fill="EAEAEA"/>
+          </w:tcPr>
+          <w:p>
+            <w:pPr>
+              <w:spacing w:before="80" w:after="80" w:line="240" w:lineRule="auto"/>
+            </w:pPr>
+            <w:r>
+              <w:rPr>
+                <w:b/>
+              </w:rPr>
+              <w:t>ArrayList</w:t>
+            </w:r>
+          </w:p>
+        </w:tc>
+        <w:tc>
+          <w:tcPr>
+            <w:tcW w:type="dxa" w:w="2635"/>
+            <w:tcBorders>
+              <w:top w:val="single" w:sz="4" w:color="D9D9D9"/>
+              <w:left w:val="single" w:sz="4" w:color="D9D9D9"/>
+              <w:bottom w:val="single" w:sz="4" w:color="D9D9D9"/>
+              <w:right w:val="single" w:sz="4" w:color="D9D9D9"/>
+            </w:tcBorders>
+            <w:shd w:fill="EAEAEA"/>
+          </w:tcPr>
+          <w:p>
+            <w:pPr>
+              <w:spacing w:before="80" w:after="80" w:line="240" w:lineRule="auto"/>
+            </w:pPr>
+            <w:r>
+              <w:rPr>
+                <w:b/>
+              </w:rPr>
+              <w:t>HashMap</w:t>
+            </w:r>
+          </w:p>
+        </w:tc>
+      </w:tr>
+      <w:tr>
+        <w:trPr>
+          <w:cantSplit/>
+        </w:trPr>
+        <w:tc>
+          <w:tcPr>
+            <w:tcW w:type="dxa" w:w="1440"/>
+            <w:tcBorders>
+              <w:top w:val="single" w:sz="4" w:color="D9D9D9"/>
+              <w:left w:val="single" w:sz="4" w:color="D9D9D9"/>
+              <w:bottom w:val="single" w:sz="4" w:color="D9D9D9"/>
+              <w:right w:val="single" w:sz="4" w:color="D9D9D9"/>
+            </w:tcBorders>
+          </w:tcPr>
+          <w:p>
+            <w:pPr>
+              <w:spacing w:before="80" w:after="80" w:line="240" w:lineRule="auto"/>
+            </w:pPr>
+            <w:r>
+              <w:t>20</w:t>
+            </w:r>
+          </w:p>
+        </w:tc>
+        <w:tc>
+          <w:tcPr>
+            <w:tcW w:type="dxa" w:w="2520"/>
+            <w:tcBorders>
+              <w:top w:val="single" w:sz="4" w:color="D9D9D9"/>
+              <w:left w:val="single" w:sz="4" w:color="D9D9D9"/>
+              <w:bottom w:val="single" w:sz="4" w:color="D9D9D9"/>
+              <w:right w:val="single" w:sz="4" w:color="D9D9D9"/>
+            </w:tcBorders>
+          </w:tcPr>
+          <w:p>
+            <w:pPr>
+              <w:spacing w:before="80" w:after="80" w:line="240" w:lineRule="auto"/>
+            </w:pPr>
+            <w:r>
+              <w:t>96</w:t>
+            </w:r>
+          </w:p>
+        </w:tc>
+        <w:tc>
+          <w:tcPr>
+            <w:tcW w:type="dxa" w:w="2736"/>
+            <w:tcBorders>
+              <w:top w:val="single" w:sz="4" w:color="D9D9D9"/>
+              <w:left w:val="single" w:sz="4" w:color="D9D9D9"/>
+              <w:bottom w:val="single" w:sz="4" w:color="D9D9D9"/>
+              <w:right w:val="single" w:sz="4" w:color="D9D9D9"/>
+            </w:tcBorders>
+          </w:tcPr>
+          <w:p>
+            <w:pPr>
+              <w:spacing w:before="80" w:after="80" w:line="240" w:lineRule="auto"/>
+            </w:pPr>
+            <w:r>
+              <w:t>128</w:t>
+            </w:r>
+          </w:p>
+        </w:tc>
+        <w:tc>
+          <w:tcPr>
+            <w:tcW w:type="dxa" w:w="2635"/>
+            <w:tcBorders>
+              <w:top w:val="single" w:sz="4" w:color="D9D9D9"/>
+              <w:left w:val="single" w:sz="4" w:color="D9D9D9"/>
+              <w:bottom w:val="single" w:sz="4" w:color="D9D9D9"/>
+              <w:right w:val="single" w:sz="4" w:color="D9D9D9"/>
+            </w:tcBorders>
+          </w:tcPr>
+          <w:p>
+            <w:pPr>
+              <w:spacing w:before="80" w:after="80" w:line="240" w:lineRule="auto"/>
+            </w:pPr>
+            <w:r>
+              <w:t>832</w:t>
+            </w:r>
+          </w:p>
+        </w:tc>
+      </w:tr>
+      <w:tr>
+        <w:trPr>
+          <w:cantSplit/>
+        </w:trPr>
+        <w:tc>
+          <w:tcPr>
+            <w:tcW w:type="dxa" w:w="1440"/>
+            <w:tcBorders>
+              <w:top w:val="single" w:sz="4" w:color="D9D9D9"/>
+              <w:left w:val="single" w:sz="4" w:color="D9D9D9"/>
+              <w:bottom w:val="single" w:sz="4" w:color="D9D9D9"/>
+              <w:right w:val="single" w:sz="4" w:color="D9D9D9"/>
+            </w:tcBorders>
+          </w:tcPr>
+          <w:p>
+            <w:pPr>
+              <w:spacing w:before="80" w:after="80" w:line="240" w:lineRule="auto"/>
+            </w:pPr>
+            <w:r>
+              <w:t>150</w:t>
+            </w:r>
+          </w:p>
+        </w:tc>
+        <w:tc>
+          <w:tcPr>
+            <w:tcW w:type="dxa" w:w="2520"/>
+            <w:tcBorders>
+              <w:top w:val="single" w:sz="4" w:color="D9D9D9"/>
+              <w:left w:val="single" w:sz="4" w:color="D9D9D9"/>
+              <w:bottom w:val="single" w:sz="4" w:color="D9D9D9"/>
+              <w:right w:val="single" w:sz="4" w:color="D9D9D9"/>
+            </w:tcBorders>
+          </w:tcPr>
+          <w:p>
+            <w:pPr>
+              <w:spacing w:before="80" w:after="80" w:line="240" w:lineRule="auto"/>
+            </w:pPr>
+            <w:r>
+              <w:t>616</w:t>
+            </w:r>
+          </w:p>
+        </w:tc>
+        <w:tc>
+          <w:tcPr>
+            <w:tcW w:type="dxa" w:w="2736"/>
+            <w:tcBorders>
+              <w:top w:val="single" w:sz="4" w:color="D9D9D9"/>
+              <w:left w:val="single" w:sz="4" w:color="D9D9D9"/>
+              <w:bottom w:val="single" w:sz="4" w:color="D9D9D9"/>
+              <w:right w:val="single" w:sz="4" w:color="D9D9D9"/>
+            </w:tcBorders>
+          </w:tcPr>
+          <w:p>
+            <w:pPr>
+              <w:spacing w:before="80" w:after="80" w:line="240" w:lineRule="auto"/>
+            </w:pPr>
+            <w:r>
+              <w:t>696</w:t>
+            </w:r>
+          </w:p>
+        </w:tc>
+        <w:tc>
+          <w:tcPr>
+            <w:tcW w:type="dxa" w:w="2635"/>
+            <w:tcBorders>
+              <w:top w:val="single" w:sz="4" w:color="D9D9D9"/>
+              <w:left w:val="single" w:sz="4" w:color="D9D9D9"/>
+              <w:bottom w:val="single" w:sz="4" w:color="D9D9D9"/>
+              <w:right w:val="single" w:sz="4" w:color="D9D9D9"/>
+            </w:tcBorders>
+          </w:tcPr>
+          <w:p>
+            <w:pPr>
+              <w:spacing w:before="80" w:after="80" w:line="240" w:lineRule="auto"/>
+            </w:pPr>
+            <w:r>
+              <w:t>5888</w:t>
+            </w:r>
+          </w:p>
+        </w:tc>
+      </w:tr>
+      <w:tr>
+        <w:trPr>
+          <w:cantSplit/>
+        </w:trPr>
+        <w:tc>
+          <w:tcPr>
+            <w:tcW w:type="dxa" w:w="1440"/>
+            <w:tcBorders>
+              <w:top w:val="single" w:sz="4" w:color="D9D9D9"/>
+              <w:left w:val="single" w:sz="4" w:color="D9D9D9"/>
+              <w:bottom w:val="single" w:sz="4" w:color="D9D9D9"/>
+              <w:right w:val="single" w:sz="4" w:color="D9D9D9"/>
+            </w:tcBorders>
+          </w:tcPr>
+          <w:p>
+            <w:pPr>
+              <w:spacing w:before="80" w:after="80" w:line="240" w:lineRule="auto"/>
+            </w:pPr>
+            <w:r>
+              <w:t>500</w:t>
+            </w:r>
+          </w:p>
+        </w:tc>
+        <w:tc>
+          <w:tcPr>
+            <w:tcW w:type="dxa" w:w="2520"/>
+            <w:tcBorders>
+              <w:top w:val="single" w:sz="4" w:color="D9D9D9"/>
+              <w:left w:val="single" w:sz="4" w:color="D9D9D9"/>
+              <w:bottom w:val="single" w:sz="4" w:color="D9D9D9"/>
+              <w:right w:val="single" w:sz="4" w:color="D9D9D9"/>
+            </w:tcBorders>
+          </w:tcPr>
+          <w:p>
+            <w:pPr>
+              <w:spacing w:before="80" w:after="80" w:line="240" w:lineRule="auto"/>
+            </w:pPr>
+            <w:r>
+              <w:t>2016</w:t>
+            </w:r>
+          </w:p>
+        </w:tc>
+        <w:tc>
+          <w:tcPr>
+            <w:tcW w:type="dxa" w:w="2736"/>
+            <w:tcBorders>
+              <w:top w:val="single" w:sz="4" w:color="D9D9D9"/>
+              <w:left w:val="single" w:sz="4" w:color="D9D9D9"/>
+              <w:bottom w:val="single" w:sz="4" w:color="D9D9D9"/>
+              <w:right w:val="single" w:sz="4" w:color="D9D9D9"/>
+            </w:tcBorders>
+          </w:tcPr>
+          <w:p>
+            <w:pPr>
+              <w:spacing w:before="80" w:after="80" w:line="240" w:lineRule="auto"/>
+            </w:pPr>
+            <w:r>
+              <w:t>2240</w:t>
+            </w:r>
+          </w:p>
+        </w:tc>
+        <w:tc>
+          <w:tcPr>
+            <w:tcW w:type="dxa" w:w="2635"/>
+            <w:tcBorders>
+              <w:top w:val="single" w:sz="4" w:color="D9D9D9"/>
+              <w:left w:val="single" w:sz="4" w:color="D9D9D9"/>
+              <w:bottom w:val="single" w:sz="4" w:color="D9D9D9"/>
+              <w:right w:val="single" w:sz="4" w:color="D9D9D9"/>
+            </w:tcBorders>
+          </w:tcPr>
+          <w:p>
+            <w:pPr>
+              <w:spacing w:before="80" w:after="80" w:line="240" w:lineRule="auto"/>
+            </w:pPr>
+            <w:r>
+              <w:t>20160</w:t>
+            </w:r>
+          </w:p>
+        </w:tc>
+      </w:tr>
+    </w:tbl>
+    <w:p>
       <w:pPr>
         <w:pStyle w:val="Heading1"/>
         <w:pageBreakBefore/>
@@ -5812,7 +7603,7 @@
         <w:rPr>
           <w:b w:val="0"/>
         </w:rPr>
-        <w:t>C. Decision: RETAIN the core model and MODIFY the application by extension and configuration. Add EBike extends Vehicle, DeliveryVan extends Car, ChallengePricing implements PricingRule, and OneDayPass implements Pass. Configure capacities {2,3,4,2,5}. Two existing classes are tightened: ParkingTicket.getSlot() now returns an immutable Position record, and ParkingFacility uses that position to release its privately held slot. This closes a mutable-reference leak while retaining admission and pricing behaviour. Existing model/service classes changed: 2. New shared classes: 4; the new entry point and tests provide execution evidence. If one combined interactive category factory were required, its registry would need two entries; this separate deterministic entry point avoids changing the baseline factory.</w:t>
+        <w:t>C. Decision: RETAIN the core model and MODIFY the application by extension and configuration. Add EBike extends Vehicle, DeliveryVan extends Car, ChallengePricing implements PricingRule, and OneDayPass implements Pass. Configure capacities {2,3,4,2,5}. Two existing classes are tightened: ParkingTicket.getSlot() now returns an immutable Position record, and ParkingFacility uses that position to release its privately held slot. This closes a mutable-reference leak while retaining admission and pricing behaviour. The Task12 feature/encapsulation changes affect 2 existing classes. Separately, the Vehicle, Car and ElectricCar constructors have optional Task6 trace statements. Therefore 5 existing shared files differ from the baseline in the final repository, with only 2 of those changes required for Task12. New shared domain classes: 4; the new entry point and tests provide execution evidence. If one combined interactive category factory were required, its registry would need two entries; this separate deterministic entry point avoids changing the baseline factory.</w:t>
       </w:r>
     </w:p>
     <w:p>
@@ -5836,7 +7627,7 @@
         <w:rPr>
           <w:b w:val="0"/>
         </w:rPr>
-        <w:t>D. Evidence: existing changed classes are ParkingTicket and ParkingFacility (2); four new shared classes implement the additional categories, pass and pricing. Original Task11 is rerun after extension, and Task12Tests checks e-bikes, peak/off-peak vans, mixed-window and overnight intervals, zero/negative durations, day-pass validity/expiry, five unequal floors, full capacity and charging suitability. Hand checks: 08:00-10:00 van = 30+60=90; 16:30-17:30 = 30+15=45; 09:00-17:00 = 8*60=480; 17:00-09:00 next day = 16*30=480. A further plain hourly type needs one subclass and creation at the app boundary; a new time-based policy needs a new PricingRule and explicit policy selection. Trade-offs are the longer O(D) van calculation, more small policy classes and a deliberate documented rounding difference. These are preferable to rewriting the allocation algorithm or spreading time windows over all vehicle classes. The final recommendation follows the two small encapsulation changes, four extension classes and executed regression/new-category results.</w:t>
+        <w:t>D. Evidence: the Task12 functional changes are in ParkingTicket and ParkingFacility (2); the three optional constructor-trace changes belong to Task6. Thus the final source comparison has 5 changed existing shared files in total; four new shared classes implement the additional categories, pass and pricing. Original Task11 is rerun after extension, and Task12Tests checks e-bikes, peak/off-peak vans, mixed-window and overnight intervals, zero/negative durations, day-pass validity/expiry, five unequal floors, full capacity and charging suitability. Hand checks: 08:00-10:00 van = 30+60=90; 16:30-17:30 = 30+15=45; 09:00-17:00 = 8*60=480; 17:00-09:00 next day = 16*30=480. A further plain hourly type needs one subclass and creation at the app boundary; a new time-based policy needs a new PricingRule and explicit policy selection. Trade-offs are the longer O(D) van calculation, more small policy classes and a deliberate documented rounding difference. These are preferable to rewriting the allocation algorithm or spreading time windows over all vehicle classes. The final recommendation follows the two functional/encapsulation changes, three optional constructor traces, four domain extension classes and executed regression/new-category results.</w:t>
       </w:r>
     </w:p>
     <w:p>

</xml_diff>